<commit_message>
Add PR-GAP-2 robson gauge expansion, JUNO datasets, soil gauge scripts, and pre-registration scope statement
Covers several in-progress research threads: PR-GAP-2 robson plane extended to
48 societies (ASPI + Cuba ensembles added), JUNO v11 regime datasets and answer
key, CAMS-CAN validation paper draft, robson/soil gauge batch scripts, and the
CAMS/JUNO v15 pre-registration Section 9 scope statement.

Co-Authored-By: Claude Sonnet 5 <noreply@anthropic.com>
</commit_message>
<xml_diff>
--- a/blind-test/CAMS_JUNO_PreRegistration_v15_Program.docx
+++ b/blind-test/CAMS_JUNO_PreRegistration_v15_Program.docx
@@ -2027,6 +2027,30 @@
       </w:pPr>
       <w:r>
         <w:t xml:space="preserve">9. Known Confounds and Scope of Claims</w:t>
+      </w:r>
+    </w:p>
+    <w:p>
+      <w:pPr>
+        <w:spacing w:after="160"/>
+        <w:jc w:val="both"/>
+      </w:pPr>
+      <w:r>
+        <w:rPr>
+          <w:sz w:val="22"/>
+        </w:rPr>
+        <w:t>CAMS is a measurement instrument for how societies absorb adaptive stress. It renders a society’s record as eight recurring functional nodes — Archive, Craft, Flow, Hands, Helm, Lore, Shield, Stewards — each scored annually on coherence, capacity, stress and abstraction, and computes node viability and inter-node coupling from those. The foundational premise is that societies are complex adaptive systems whose dynamics leave recoverable traces in the historical record.</w:t>
+      </w:r>
+    </w:p>
+    <w:p>
+      <w:pPr>
+        <w:spacing w:after="160"/>
+        <w:jc w:val="both"/>
+      </w:pPr>
+      <w:r>
+        <w:rPr>
+          <w:sz w:val="22"/>
+        </w:rPr>
+        <w:t>What the instrument has been shown to do is morphological: place a society in its structural family, identify which functions carry the deformation when stress arrives, and establish that a given society tends to route stress through the same functions across widely separated episodes. It does not predict the future. Whether recovery restores the prior configuration or transforms it has been tested and not demonstrated. Magnitudes do not travel between scorers; only shapes do — and every dynamical claim must clear a measured noise floor built from the framework’s own refuted results.</w:t>
       </w:r>
     </w:p>
     <w:p>

</xml_diff>